<commit_message>
feat: add pandas statistics and formatted prints for task2
</commit_message>
<xml_diff>
--- a/task1/tcp_packet_capture.docx
+++ b/task1/tcp_packet_capture.docx
@@ -42,7 +42,7 @@
           <w:szCs w:val="32"/>
           <w:u w:val="single"/>
         </w:rPr>
-        <w:t xml:space="preserve"> 2023</w:t>
+        <w:t xml:space="preserve"> 202</w:t>
       </w:r>
       <w:r>
         <w:rPr>
@@ -50,8 +50,10 @@
           <w:b/>
           <w:sz w:val="32"/>
           <w:szCs w:val="32"/>
-        </w:rPr>
-        <w:t>学年—</w:t>
+          <w:u w:val="single"/>
+          <w:lang w:val="en-US" w:eastAsia="zh-CN"/>
+        </w:rPr>
+        <w:t>5</w:t>
       </w:r>
       <w:r>
         <w:rPr>
@@ -59,9 +61,29 @@
           <w:b/>
           <w:sz w:val="32"/>
           <w:szCs w:val="32"/>
-          <w:u w:val="single"/>
-        </w:rPr>
-        <w:t>2024</w:t>
+        </w:rPr>
+        <w:t>学年—</w:t>
+      </w:r>
+      <w:r>
+        <w:rPr>
+          <w:rFonts w:hint="eastAsia" w:ascii="黑体" w:eastAsia="黑体"/>
+          <w:b/>
+          <w:sz w:val="32"/>
+          <w:szCs w:val="32"/>
+          <w:u w:val="single"/>
+        </w:rPr>
+        <w:t>202</w:t>
+      </w:r>
+      <w:r>
+        <w:rPr>
+          <w:rFonts w:hint="eastAsia" w:ascii="黑体" w:eastAsia="黑体"/>
+          <w:b/>
+          <w:sz w:val="32"/>
+          <w:szCs w:val="32"/>
+          <w:u w:val="single"/>
+          <w:lang w:val="en-US" w:eastAsia="zh-CN"/>
+        </w:rPr>
+        <w:t>6</w:t>
       </w:r>
       <w:r>
         <w:rPr>
@@ -600,50 +622,139 @@
       </w:r>
     </w:p>
     <w:p>
-      <w:r>
+      <w:pPr>
+        <w:rPr>
+          <w:rFonts w:hint="default" w:ascii="Times New Roman" w:hAnsi="Times New Roman" w:eastAsia="宋体" w:cs="Times New Roman"/>
+          <w:sz w:val="24"/>
+          <w:szCs w:val="24"/>
+        </w:rPr>
+      </w:pPr>
+      <w:r>
+        <w:rPr>
+          <w:rFonts w:hint="default" w:ascii="Times New Roman" w:hAnsi="Times New Roman" w:eastAsia="宋体" w:cs="Times New Roman"/>
+          <w:sz w:val="24"/>
+          <w:szCs w:val="24"/>
+        </w:rPr>
         <w:t>以下即是对总体工作过程的描述，也包含待完成的功能点，请仔细阅读。</w:t>
       </w:r>
     </w:p>
     <w:p>
-      <w:r>
+      <w:pPr>
+        <w:rPr>
+          <w:rFonts w:hint="default" w:ascii="Times New Roman" w:hAnsi="Times New Roman" w:eastAsia="宋体" w:cs="Times New Roman"/>
+          <w:sz w:val="24"/>
+          <w:szCs w:val="24"/>
+        </w:rPr>
+      </w:pPr>
+      <w:r>
+        <w:rPr>
+          <w:rFonts w:hint="default" w:ascii="Times New Roman" w:hAnsi="Times New Roman" w:eastAsia="宋体" w:cs="Times New Roman"/>
+          <w:sz w:val="24"/>
+          <w:szCs w:val="24"/>
+        </w:rPr>
         <w:t>(1)client和server都是基于TCP的命令行程序。client运行在host os，server运行在guest os。</w:t>
       </w:r>
     </w:p>
     <w:p>
-      <w:r>
+      <w:pPr>
+        <w:rPr>
+          <w:rFonts w:hint="default" w:ascii="Times New Roman" w:hAnsi="Times New Roman" w:eastAsia="宋体" w:cs="Times New Roman"/>
+          <w:sz w:val="24"/>
+          <w:szCs w:val="24"/>
+        </w:rPr>
+      </w:pPr>
+      <w:r>
+        <w:rPr>
+          <w:rFonts w:hint="default" w:ascii="Times New Roman" w:hAnsi="Times New Roman" w:eastAsia="宋体" w:cs="Times New Roman"/>
+          <w:sz w:val="24"/>
+          <w:szCs w:val="24"/>
+        </w:rPr>
         <w:t>(2)client发送一个全英文可打印字符的ASCII文件（这个文件你要自己构造）。</w:t>
       </w:r>
     </w:p>
     <w:p>
-      <w:r>
+      <w:pPr>
+        <w:rPr>
+          <w:rFonts w:hint="default" w:ascii="Times New Roman" w:hAnsi="Times New Roman" w:eastAsia="宋体" w:cs="Times New Roman"/>
+          <w:sz w:val="24"/>
+          <w:szCs w:val="24"/>
+        </w:rPr>
+      </w:pPr>
+      <w:r>
+        <w:rPr>
+          <w:rFonts w:hint="default" w:ascii="Times New Roman" w:hAnsi="Times New Roman" w:eastAsia="宋体" w:cs="Times New Roman"/>
+          <w:sz w:val="24"/>
+          <w:szCs w:val="24"/>
+        </w:rPr>
         <w:t>a.client每次发送这个文件“不定长的一段”给server，由server把这块文本reverse（例如，“a</w:t>
       </w:r>
       <w:r>
         <w:rPr>
-          <w:rFonts w:hint="eastAsia"/>
+          <w:rFonts w:hint="default" w:ascii="Times New Roman" w:hAnsi="Times New Roman" w:eastAsia="宋体" w:cs="Times New Roman"/>
+          <w:sz w:val="24"/>
+          <w:szCs w:val="24"/>
           <w:lang w:val="en-US" w:eastAsia="zh-CN"/>
         </w:rPr>
         <w:t xml:space="preserve"> </w:t>
       </w:r>
       <w:r>
+        <w:rPr>
+          <w:rFonts w:hint="default" w:ascii="Times New Roman" w:hAnsi="Times New Roman" w:eastAsia="宋体" w:cs="Times New Roman"/>
+          <w:sz w:val="24"/>
+          <w:szCs w:val="24"/>
+        </w:rPr>
         <w:t>little monkey”变成“yeknom elttil a”），并返回给client，client在终端打印显示。</w:t>
       </w:r>
     </w:p>
     <w:p>
-      <w:r>
+      <w:pPr>
+        <w:rPr>
+          <w:rFonts w:hint="default" w:ascii="Times New Roman" w:hAnsi="Times New Roman" w:eastAsia="宋体" w:cs="Times New Roman"/>
+          <w:sz w:val="24"/>
+          <w:szCs w:val="24"/>
+        </w:rPr>
+      </w:pPr>
+      <w:r>
+        <w:rPr>
+          <w:rFonts w:hint="default" w:ascii="Times New Roman" w:hAnsi="Times New Roman" w:eastAsia="宋体" w:cs="Times New Roman"/>
+          <w:sz w:val="24"/>
+          <w:szCs w:val="24"/>
+        </w:rPr>
         <w:t>b.最终client要输出一个文本文件，该文件是原始文件的全部反转。</w:t>
       </w:r>
     </w:p>
     <w:p>
-      <w:r>
+      <w:pPr>
+        <w:rPr>
+          <w:rFonts w:hint="default" w:ascii="Times New Roman" w:hAnsi="Times New Roman" w:eastAsia="宋体" w:cs="Times New Roman"/>
+          <w:sz w:val="24"/>
+          <w:szCs w:val="24"/>
+        </w:rPr>
+      </w:pPr>
+      <w:r>
+        <w:rPr>
+          <w:rFonts w:hint="default" w:ascii="Times New Roman" w:hAnsi="Times New Roman" w:eastAsia="宋体" w:cs="Times New Roman"/>
+          <w:sz w:val="24"/>
+          <w:szCs w:val="24"/>
+        </w:rPr>
         <w:t>(3)client和server之间的交互如图1：</w:t>
       </w:r>
     </w:p>
     <w:p>
       <w:pPr>
         <w:jc w:val="center"/>
-      </w:pPr>
-      <w:r>
+        <w:rPr>
+          <w:rFonts w:hint="default" w:ascii="Times New Roman" w:hAnsi="Times New Roman" w:eastAsia="宋体" w:cs="Times New Roman"/>
+          <w:sz w:val="24"/>
+          <w:szCs w:val="24"/>
+        </w:rPr>
+      </w:pPr>
+      <w:r>
+        <w:rPr>
+          <w:rFonts w:hint="default" w:ascii="Times New Roman" w:hAnsi="Times New Roman" w:eastAsia="宋体" w:cs="Times New Roman"/>
+          <w:sz w:val="24"/>
+          <w:szCs w:val="24"/>
+        </w:rPr>
         <w:drawing>
           <wp:inline distT="0" distB="0" distL="114300" distR="114300">
             <wp:extent cx="3839845" cy="2714625"/>
@@ -688,25 +799,71 @@
       </w:r>
     </w:p>
     <w:p>
-      <w:r>
+      <w:pPr>
+        <w:rPr>
+          <w:rFonts w:hint="default" w:ascii="Times New Roman" w:hAnsi="Times New Roman" w:eastAsia="宋体" w:cs="Times New Roman"/>
+          <w:sz w:val="24"/>
+          <w:szCs w:val="24"/>
+        </w:rPr>
+      </w:pPr>
+      <w:r>
+        <w:rPr>
+          <w:rFonts w:hint="default" w:ascii="Times New Roman" w:hAnsi="Times New Roman" w:eastAsia="宋体" w:cs="Times New Roman"/>
+          <w:sz w:val="24"/>
+          <w:szCs w:val="24"/>
+        </w:rPr>
         <w:t>a.程序运行时，须自动生成一份运行日志文件`run_log.txt`，记录每一次报文的发送与接收事件。</w:t>
       </w:r>
     </w:p>
     <w:p>
-      <w:r>
+      <w:pPr>
+        <w:rPr>
+          <w:rFonts w:hint="default" w:ascii="Times New Roman" w:hAnsi="Times New Roman" w:eastAsia="宋体" w:cs="Times New Roman"/>
+          <w:sz w:val="24"/>
+          <w:szCs w:val="24"/>
+        </w:rPr>
+      </w:pPr>
+      <w:r>
+        <w:rPr>
+          <w:rFonts w:hint="default" w:ascii="Times New Roman" w:hAnsi="Times New Roman" w:eastAsia="宋体" w:cs="Times New Roman"/>
+          <w:sz w:val="24"/>
+          <w:szCs w:val="24"/>
+        </w:rPr>
         <w:t>b.提交时，`run_log.txt`中的时间戳须与wireshark抓包截图中对应报文的时间戳能够相互印证。验收时会对照二者进行核查。</w:t>
       </w:r>
     </w:p>
     <w:p>
-      <w:r>
+      <w:pPr>
+        <w:rPr>
+          <w:rFonts w:hint="default" w:ascii="Times New Roman" w:hAnsi="Times New Roman" w:eastAsia="宋体" w:cs="Times New Roman"/>
+          <w:sz w:val="24"/>
+          <w:szCs w:val="24"/>
+        </w:rPr>
+      </w:pPr>
+      <w:r>
+        <w:rPr>
+          <w:rFonts w:hint="default" w:ascii="Times New Roman" w:hAnsi="Times New Roman" w:eastAsia="宋体" w:cs="Times New Roman"/>
+          <w:sz w:val="24"/>
+          <w:szCs w:val="24"/>
+        </w:rPr>
         <w:t>(4)client和server之间共4种类型报文，`Initialization`、`agree`、`reverseRequest`、`reverseAnswer`。各报文封装如图2所示：</w:t>
       </w:r>
     </w:p>
     <w:p>
       <w:pPr>
         <w:jc w:val="center"/>
-      </w:pPr>
-      <w:r>
+        <w:rPr>
+          <w:rFonts w:hint="default" w:ascii="Times New Roman" w:hAnsi="Times New Roman" w:eastAsia="宋体" w:cs="Times New Roman"/>
+          <w:sz w:val="24"/>
+          <w:szCs w:val="24"/>
+        </w:rPr>
+      </w:pPr>
+      <w:r>
+        <w:rPr>
+          <w:rFonts w:hint="default" w:ascii="Times New Roman" w:hAnsi="Times New Roman" w:eastAsia="宋体" w:cs="Times New Roman"/>
+          <w:sz w:val="24"/>
+          <w:szCs w:val="24"/>
+        </w:rPr>
         <w:drawing>
           <wp:inline distT="0" distB="0" distL="114300" distR="114300">
             <wp:extent cx="4020820" cy="2759075"/>
@@ -751,136 +908,1335 @@
       </w:r>
     </w:p>
     <w:p>
-      <w:r>
+      <w:pPr>
+        <w:rPr>
+          <w:rFonts w:hint="default" w:ascii="Times New Roman" w:hAnsi="Times New Roman" w:eastAsia="宋体" w:cs="Times New Roman"/>
+          <w:sz w:val="24"/>
+          <w:szCs w:val="24"/>
+        </w:rPr>
+      </w:pPr>
+      <w:r>
+        <w:rPr>
+          <w:rFonts w:hint="default" w:ascii="Times New Roman" w:hAnsi="Times New Roman" w:eastAsia="宋体" w:cs="Times New Roman"/>
+          <w:sz w:val="24"/>
+          <w:szCs w:val="24"/>
+        </w:rPr>
         <w:t>(5)对图2的文字描述：四种报文类型，通过Type字段来区分。</w:t>
       </w:r>
     </w:p>
     <w:p>
-      <w:r>
+      <w:pPr>
+        <w:rPr>
+          <w:rFonts w:hint="default" w:ascii="Times New Roman" w:hAnsi="Times New Roman" w:eastAsia="宋体" w:cs="Times New Roman"/>
+          <w:sz w:val="24"/>
+          <w:szCs w:val="24"/>
+        </w:rPr>
+      </w:pPr>
+      <w:r>
+        <w:rPr>
+          <w:rFonts w:hint="default" w:ascii="Times New Roman" w:hAnsi="Times New Roman" w:eastAsia="宋体" w:cs="Times New Roman"/>
+          <w:sz w:val="24"/>
+          <w:szCs w:val="24"/>
+        </w:rPr>
         <w:t>client端向server端发送Initialization报文，告知server要做reverse的块数N，server回复agree报文。client逐次向server发送reverseRequest报文，包含了要做reverse的数据；server端返回reverseAnswer报文，其中包含了reverse之后的数据。</w:t>
       </w:r>
     </w:p>
     <w:p>
-      <w:r>
+      <w:pPr>
+        <w:rPr>
+          <w:rFonts w:hint="default" w:ascii="Times New Roman" w:hAnsi="Times New Roman" w:eastAsia="宋体" w:cs="Times New Roman"/>
+          <w:sz w:val="24"/>
+          <w:szCs w:val="24"/>
+        </w:rPr>
+      </w:pPr>
+      <w:r>
+        <w:rPr>
+          <w:rFonts w:hint="default" w:ascii="Times New Roman" w:hAnsi="Times New Roman" w:eastAsia="宋体" w:cs="Times New Roman"/>
+          <w:sz w:val="24"/>
+          <w:szCs w:val="24"/>
+        </w:rPr>
         <w:t>reverseRequest、reverseAnswer报文中Length字段分别指的是Data和reverseData的长度，单位是Byte。</w:t>
       </w:r>
     </w:p>
     <w:p>
-      <w:r>
+      <w:pPr>
+        <w:rPr>
+          <w:rFonts w:hint="default" w:ascii="Times New Roman" w:hAnsi="Times New Roman" w:eastAsia="宋体" w:cs="Times New Roman"/>
+          <w:sz w:val="24"/>
+          <w:szCs w:val="24"/>
+        </w:rPr>
+      </w:pPr>
+      <w:r>
+        <w:rPr>
+          <w:rFonts w:hint="default" w:ascii="Times New Roman" w:hAnsi="Times New Roman" w:eastAsia="宋体" w:cs="Times New Roman"/>
+          <w:sz w:val="24"/>
+          <w:szCs w:val="24"/>
+        </w:rPr>
         <w:t>(6)client端在程序启动时，在命令行中指定serverIP、serverPort。</w:t>
       </w:r>
     </w:p>
     <w:p>
-      <w:r>
+      <w:pPr>
+        <w:rPr>
+          <w:rFonts w:hint="default" w:ascii="Times New Roman" w:hAnsi="Times New Roman" w:eastAsia="宋体" w:cs="Times New Roman"/>
+          <w:sz w:val="24"/>
+          <w:szCs w:val="24"/>
+        </w:rPr>
+      </w:pPr>
+      <w:r>
+        <w:rPr>
+          <w:rFonts w:hint="default" w:ascii="Times New Roman" w:hAnsi="Times New Roman" w:eastAsia="宋体" w:cs="Times New Roman"/>
+          <w:sz w:val="24"/>
+          <w:szCs w:val="24"/>
+        </w:rPr>
         <w:t>(7)client每次发送的reverseRequest中的长度都不一样（即不是例如每次固定发送500字节），长度限定在一个`[Lmin,Lmax]`之间，最后一块除外。</w:t>
       </w:r>
     </w:p>
     <w:p>
-      <w:r>
+      <w:pPr>
+        <w:rPr>
+          <w:rFonts w:hint="default" w:ascii="Times New Roman" w:hAnsi="Times New Roman" w:eastAsia="宋体" w:cs="Times New Roman"/>
+          <w:sz w:val="24"/>
+          <w:szCs w:val="24"/>
+        </w:rPr>
+      </w:pPr>
+      <w:r>
+        <w:rPr>
+          <w:rFonts w:hint="default" w:ascii="Times New Roman" w:hAnsi="Times New Roman" w:eastAsia="宋体" w:cs="Times New Roman"/>
+          <w:sz w:val="24"/>
+          <w:szCs w:val="24"/>
+        </w:rPr>
         <w:t>a.Lmin、Lmax在命令行中指定。</w:t>
       </w:r>
     </w:p>
     <w:p>
-      <w:r>
+      <w:pPr>
+        <w:rPr>
+          <w:rFonts w:hint="default" w:ascii="Times New Roman" w:hAnsi="Times New Roman" w:eastAsia="宋体" w:cs="Times New Roman"/>
+          <w:sz w:val="24"/>
+          <w:szCs w:val="24"/>
+        </w:rPr>
+      </w:pPr>
+      <w:r>
+        <w:rPr>
+          <w:rFonts w:hint="default" w:ascii="Times New Roman" w:hAnsi="Times New Roman" w:eastAsia="宋体" w:cs="Times New Roman"/>
+          <w:sz w:val="24"/>
+          <w:szCs w:val="24"/>
+        </w:rPr>
         <w:t>b.在开始发送数据块前，要先随机确定待发送File中的各块的Bytes长度，再计算块数N，才能执行“client-&gt;server的Initialization报文”。</w:t>
       </w:r>
     </w:p>
     <w:p>
-      <w:r>
+      <w:pPr>
+        <w:rPr>
+          <w:rFonts w:hint="default" w:ascii="Times New Roman" w:hAnsi="Times New Roman" w:eastAsia="宋体" w:cs="Times New Roman"/>
+          <w:sz w:val="24"/>
+          <w:szCs w:val="24"/>
+        </w:rPr>
+      </w:pPr>
+      <w:r>
+        <w:rPr>
+          <w:rFonts w:hint="default" w:ascii="Times New Roman" w:hAnsi="Times New Roman" w:eastAsia="宋体" w:cs="Times New Roman"/>
+          <w:sz w:val="24"/>
+          <w:szCs w:val="24"/>
+        </w:rPr>
         <w:t>c.验收时，会给出一组具体的参数（文件内容、Lmin、Lmax、chunk_seed），要求你能够现场口算或手推出块数N以及第1块、第2块的长度分别是多少。这不需要你背代码，但需要你理解自己代码中分块逻辑的实现方式。</w:t>
       </w:r>
     </w:p>
     <w:p>
-      <w:r>
+      <w:pPr>
+        <w:rPr>
+          <w:rFonts w:hint="default" w:ascii="Times New Roman" w:hAnsi="Times New Roman" w:eastAsia="宋体" w:cs="Times New Roman"/>
+          <w:sz w:val="24"/>
+          <w:szCs w:val="24"/>
+        </w:rPr>
+      </w:pPr>
+      <w:r>
+        <w:rPr>
+          <w:rFonts w:hint="default" w:ascii="Times New Roman" w:hAnsi="Times New Roman" w:eastAsia="宋体" w:cs="Times New Roman"/>
+          <w:sz w:val="24"/>
+          <w:szCs w:val="24"/>
+        </w:rPr>
         <w:t>例如：“你的文件是520字节，Lmin=50，Lmax=100，seed=42，random依次生成了73、91、58……那你的N是多少？第3块的起始字节是哪里？”。请确保你能清晰描述分块算法，并在代码中指出对应函数的位置。</w:t>
       </w:r>
     </w:p>
     <w:p>
-      <w:r>
+      <w:pPr>
+        <w:rPr>
+          <w:rFonts w:hint="default" w:ascii="Times New Roman" w:hAnsi="Times New Roman" w:eastAsia="宋体" w:cs="Times New Roman"/>
+          <w:sz w:val="24"/>
+          <w:szCs w:val="24"/>
+        </w:rPr>
+      </w:pPr>
+      <w:r>
+        <w:rPr>
+          <w:rFonts w:hint="default" w:ascii="Times New Roman" w:hAnsi="Times New Roman" w:eastAsia="宋体" w:cs="Times New Roman"/>
+          <w:sz w:val="24"/>
+          <w:szCs w:val="24"/>
+        </w:rPr>
         <w:t>(8)每次client收到来自server的reverseAnswer报文，都在命令行下打印出来“第x块：反转的文本”。如“8:yeknom</w:t>
       </w:r>
       <w:r>
         <w:rPr>
+          <w:rFonts w:hint="default" w:ascii="Times New Roman" w:hAnsi="Times New Roman" w:eastAsia="宋体" w:cs="Times New Roman"/>
+          <w:sz w:val="24"/>
+          <w:szCs w:val="24"/>
+          <w:lang w:val="en-US" w:eastAsia="zh-CN"/>
+        </w:rPr>
+        <w:t xml:space="preserve"> </w:t>
+      </w:r>
+      <w:r>
+        <w:rPr>
+          <w:rFonts w:hint="default" w:ascii="Times New Roman" w:hAnsi="Times New Roman" w:eastAsia="宋体" w:cs="Times New Roman"/>
+          <w:sz w:val="24"/>
+          <w:szCs w:val="24"/>
+        </w:rPr>
+        <w:t>elttil a。</w:t>
+      </w:r>
+    </w:p>
+    <w:p>
+      <w:pPr>
+        <w:rPr>
+          <w:rFonts w:hint="default" w:ascii="Times New Roman" w:hAnsi="Times New Roman" w:eastAsia="宋体" w:cs="Times New Roman"/>
+          <w:sz w:val="24"/>
+          <w:szCs w:val="24"/>
+        </w:rPr>
+      </w:pPr>
+      <w:r>
+        <w:rPr>
+          <w:rFonts w:hint="default" w:ascii="Times New Roman" w:hAnsi="Times New Roman" w:eastAsia="宋体" w:cs="Times New Roman"/>
+          <w:sz w:val="24"/>
+          <w:szCs w:val="24"/>
+        </w:rPr>
+        <w:t>(9)server能够同时处理2个及以上client的同时请求。</w:t>
+      </w:r>
+    </w:p>
+    <w:p>
+      <w:pPr>
+        <w:jc w:val="both"/>
+        <w:rPr>
           <w:rFonts w:hint="eastAsia"/>
           <w:lang w:val="en-US" w:eastAsia="zh-CN"/>
         </w:rPr>
-        <w:t xml:space="preserve"> </w:t>
-      </w:r>
-      <w:r>
-        <w:t>elttil a。</w:t>
-      </w:r>
-    </w:p>
-    <w:p>
-      <w:r>
-        <w:t>(9)server能够同时处理2个及以上client的同时请求。</w:t>
-      </w:r>
-    </w:p>
-    <w:p>
-      <w:pPr>
-        <w:jc w:val="both"/>
-        <w:rPr>
-          <w:rFonts w:hint="eastAsia"/>
-          <w:lang w:val="en-US" w:eastAsia="zh-CN"/>
-        </w:rPr>
-      </w:pPr>
-    </w:p>
-    <w:p>
-      <w:pPr>
-        <w:rPr>
-          <w:rFonts w:hint="eastAsia" w:ascii="黑体" w:eastAsia="黑体"/>
-          <w:sz w:val="30"/>
-          <w:szCs w:val="30"/>
-          <w:lang w:val="en-US" w:eastAsia="zh-CN"/>
-        </w:rPr>
-      </w:pPr>
-      <w:r>
-        <w:rPr>
-          <w:rFonts w:hint="eastAsia" w:ascii="黑体" w:eastAsia="黑体"/>
-          <w:sz w:val="30"/>
-          <w:szCs w:val="30"/>
-        </w:rPr>
-        <w:t>实现方法</w:t>
+      </w:pPr>
+    </w:p>
+    <w:p>
+      <w:pPr>
+        <w:rPr>
+          <w:rFonts w:hint="eastAsia" w:ascii="黑体" w:eastAsia="黑体"/>
+          <w:sz w:val="30"/>
+          <w:szCs w:val="30"/>
+        </w:rPr>
+      </w:pPr>
+      <w:r>
+        <w:rPr>
+          <w:rFonts w:hint="eastAsia" w:ascii="黑体" w:eastAsia="黑体"/>
+          <w:sz w:val="30"/>
+          <w:szCs w:val="30"/>
+        </w:rPr>
+        <w:br w:type="page"/>
+      </w:r>
+    </w:p>
+    <w:p>
+      <w:pPr>
+        <w:rPr>
+          <w:rFonts w:hint="eastAsia" w:ascii="黑体" w:eastAsia="黑体"/>
+          <w:sz w:val="30"/>
+          <w:szCs w:val="30"/>
+          <w:lang w:val="en-US" w:eastAsia="zh-CN"/>
+        </w:rPr>
+      </w:pPr>
+      <w:r>
+        <w:rPr>
+          <w:rFonts w:hint="eastAsia" w:ascii="黑体" w:eastAsia="黑体"/>
+          <w:sz w:val="30"/>
+          <w:szCs w:val="30"/>
+        </w:rPr>
+        <w:t>实现</w:t>
+      </w:r>
+      <w:r>
+        <w:rPr>
+          <w:rFonts w:hint="eastAsia" w:ascii="黑体" w:eastAsia="黑体"/>
+          <w:sz w:val="30"/>
+          <w:szCs w:val="30"/>
+          <w:lang w:val="en-US" w:eastAsia="zh-CN"/>
+        </w:rPr>
+        <w:t>结果:</w:t>
+      </w:r>
+    </w:p>
+    <w:p>
+      <w:pPr>
+        <w:rPr>
+          <w:rFonts w:hint="default" w:ascii="Times New Roman" w:hAnsi="Times New Roman" w:eastAsia="宋体" w:cs="Times New Roman"/>
+          <w:sz w:val="24"/>
+          <w:szCs w:val="24"/>
+          <w:lang w:val="en-US" w:eastAsia="zh-CN"/>
+        </w:rPr>
+      </w:pPr>
+      <w:r>
+        <w:rPr>
+          <w:rFonts w:hint="default" w:ascii="Times New Roman" w:hAnsi="Times New Roman" w:eastAsia="宋体" w:cs="Times New Roman"/>
+          <w:sz w:val="24"/>
+          <w:szCs w:val="24"/>
+          <w:lang w:val="en-US" w:eastAsia="zh-CN"/>
+        </w:rPr>
+        <w:t>a.Wireshark包捕获截图</w:t>
+      </w:r>
+    </w:p>
+    <w:p>
+      <w:pPr>
+        <w:rPr>
+          <w:rFonts w:hint="default" w:ascii="Times New Roman" w:hAnsi="Times New Roman" w:eastAsia="宋体" w:cs="Times New Roman"/>
+          <w:sz w:val="24"/>
+          <w:szCs w:val="24"/>
+          <w:lang w:val="en-US" w:eastAsia="zh-CN"/>
+        </w:rPr>
+      </w:pPr>
+    </w:p>
+    <w:p>
+      <w:pPr>
+        <w:rPr>
+          <w:rFonts w:hint="default" w:ascii="Times New Roman" w:hAnsi="Times New Roman" w:eastAsia="宋体" w:cs="Times New Roman"/>
+          <w:sz w:val="24"/>
+          <w:szCs w:val="24"/>
+          <w:lang w:val="en-US" w:eastAsia="zh-CN"/>
+        </w:rPr>
+      </w:pPr>
+      <w:r>
+        <w:rPr>
+          <w:rFonts w:hint="default" w:ascii="Times New Roman" w:hAnsi="Times New Roman" w:eastAsia="宋体" w:cs="Times New Roman"/>
+          <w:sz w:val="24"/>
+          <w:szCs w:val="24"/>
+          <w:lang w:val="en-US" w:eastAsia="zh-CN"/>
+        </w:rPr>
+        <w:drawing>
+          <wp:inline distT="0" distB="0" distL="114300" distR="114300">
+            <wp:extent cx="2562225" cy="2346960"/>
+            <wp:effectExtent l="0" t="0" r="3175" b="2540"/>
+            <wp:docPr id="13" name="图片 13" descr="12f0dccb9cd2e7a84b544066112808d1"/>
+            <wp:cNvGraphicFramePr>
+              <a:graphicFrameLocks xmlns:a="http://schemas.openxmlformats.org/drawingml/2006/main" noChangeAspect="1"/>
+            </wp:cNvGraphicFramePr>
+            <a:graphic xmlns:a="http://schemas.openxmlformats.org/drawingml/2006/main">
+              <a:graphicData uri="http://schemas.openxmlformats.org/drawingml/2006/picture">
+                <pic:pic xmlns:pic="http://schemas.openxmlformats.org/drawingml/2006/picture">
+                  <pic:nvPicPr>
+                    <pic:cNvPr id="13" name="图片 13" descr="12f0dccb9cd2e7a84b544066112808d1"/>
+                    <pic:cNvPicPr>
+                      <a:picLocks noChangeAspect="1"/>
+                    </pic:cNvPicPr>
+                  </pic:nvPicPr>
+                  <pic:blipFill>
+                    <a:blip r:embed="rId6"/>
+                    <a:stretch>
+                      <a:fillRect/>
+                    </a:stretch>
+                  </pic:blipFill>
+                  <pic:spPr>
+                    <a:xfrm>
+                      <a:off x="0" y="0"/>
+                      <a:ext cx="2562225" cy="2346960"/>
+                    </a:xfrm>
+                    <a:prstGeom prst="rect">
+                      <a:avLst/>
+                    </a:prstGeom>
+                  </pic:spPr>
+                </pic:pic>
+              </a:graphicData>
+            </a:graphic>
+          </wp:inline>
+        </w:drawing>
+      </w:r>
+      <w:r>
+        <w:rPr>
+          <w:rFonts w:hint="default" w:ascii="Times New Roman" w:hAnsi="Times New Roman" w:eastAsia="宋体" w:cs="Times New Roman"/>
+          <w:sz w:val="24"/>
+          <w:szCs w:val="24"/>
+          <w:lang w:val="en-US" w:eastAsia="zh-CN"/>
+        </w:rPr>
+        <w:drawing>
+          <wp:inline distT="0" distB="0" distL="114300" distR="114300">
+            <wp:extent cx="2554605" cy="2339340"/>
+            <wp:effectExtent l="0" t="0" r="10795" b="10160"/>
+            <wp:docPr id="14" name="图片 14" descr="9f2ed7fe018284098e074cec503ff686"/>
+            <wp:cNvGraphicFramePr>
+              <a:graphicFrameLocks xmlns:a="http://schemas.openxmlformats.org/drawingml/2006/main" noChangeAspect="1"/>
+            </wp:cNvGraphicFramePr>
+            <a:graphic xmlns:a="http://schemas.openxmlformats.org/drawingml/2006/main">
+              <a:graphicData uri="http://schemas.openxmlformats.org/drawingml/2006/picture">
+                <pic:pic xmlns:pic="http://schemas.openxmlformats.org/drawingml/2006/picture">
+                  <pic:nvPicPr>
+                    <pic:cNvPr id="14" name="图片 14" descr="9f2ed7fe018284098e074cec503ff686"/>
+                    <pic:cNvPicPr>
+                      <a:picLocks noChangeAspect="1"/>
+                    </pic:cNvPicPr>
+                  </pic:nvPicPr>
+                  <pic:blipFill>
+                    <a:blip r:embed="rId7"/>
+                    <a:stretch>
+                      <a:fillRect/>
+                    </a:stretch>
+                  </pic:blipFill>
+                  <pic:spPr>
+                    <a:xfrm>
+                      <a:off x="0" y="0"/>
+                      <a:ext cx="2554605" cy="2339340"/>
+                    </a:xfrm>
+                    <a:prstGeom prst="rect">
+                      <a:avLst/>
+                    </a:prstGeom>
+                  </pic:spPr>
+                </pic:pic>
+              </a:graphicData>
+            </a:graphic>
+          </wp:inline>
+        </w:drawing>
+      </w:r>
+      <w:r>
+        <w:rPr>
+          <w:rFonts w:hint="default" w:ascii="Times New Roman" w:hAnsi="Times New Roman" w:eastAsia="宋体" w:cs="Times New Roman"/>
+          <w:sz w:val="24"/>
+          <w:szCs w:val="24"/>
+          <w:lang w:val="en-US" w:eastAsia="zh-CN"/>
+        </w:rPr>
+        <w:drawing>
+          <wp:inline distT="0" distB="0" distL="114300" distR="114300">
+            <wp:extent cx="2561590" cy="2345690"/>
+            <wp:effectExtent l="0" t="0" r="3810" b="3810"/>
+            <wp:docPr id="15" name="图片 15" descr="b7b50458d0ac81df3e329771e3d206f5"/>
+            <wp:cNvGraphicFramePr>
+              <a:graphicFrameLocks xmlns:a="http://schemas.openxmlformats.org/drawingml/2006/main" noChangeAspect="1"/>
+            </wp:cNvGraphicFramePr>
+            <a:graphic xmlns:a="http://schemas.openxmlformats.org/drawingml/2006/main">
+              <a:graphicData uri="http://schemas.openxmlformats.org/drawingml/2006/picture">
+                <pic:pic xmlns:pic="http://schemas.openxmlformats.org/drawingml/2006/picture">
+                  <pic:nvPicPr>
+                    <pic:cNvPr id="15" name="图片 15" descr="b7b50458d0ac81df3e329771e3d206f5"/>
+                    <pic:cNvPicPr>
+                      <a:picLocks noChangeAspect="1"/>
+                    </pic:cNvPicPr>
+                  </pic:nvPicPr>
+                  <pic:blipFill>
+                    <a:blip r:embed="rId8"/>
+                    <a:stretch>
+                      <a:fillRect/>
+                    </a:stretch>
+                  </pic:blipFill>
+                  <pic:spPr>
+                    <a:xfrm>
+                      <a:off x="0" y="0"/>
+                      <a:ext cx="2561590" cy="2345690"/>
+                    </a:xfrm>
+                    <a:prstGeom prst="rect">
+                      <a:avLst/>
+                    </a:prstGeom>
+                  </pic:spPr>
+                </pic:pic>
+              </a:graphicData>
+            </a:graphic>
+          </wp:inline>
+        </w:drawing>
+      </w:r>
+      <w:r>
+        <w:rPr>
+          <w:rFonts w:hint="default" w:ascii="Times New Roman" w:hAnsi="Times New Roman" w:eastAsia="宋体" w:cs="Times New Roman"/>
+          <w:sz w:val="24"/>
+          <w:szCs w:val="24"/>
+          <w:lang w:val="en-US" w:eastAsia="zh-CN"/>
+        </w:rPr>
+        <w:t xml:space="preserve">  </w:t>
+      </w:r>
+      <w:r>
+        <w:rPr>
+          <w:rFonts w:hint="default" w:ascii="Times New Roman" w:hAnsi="Times New Roman" w:eastAsia="宋体" w:cs="Times New Roman"/>
+          <w:sz w:val="24"/>
+          <w:szCs w:val="24"/>
+          <w:lang w:val="en-US" w:eastAsia="zh-CN"/>
+        </w:rPr>
+        <w:drawing>
+          <wp:inline distT="0" distB="0" distL="114300" distR="114300">
+            <wp:extent cx="2533650" cy="2319020"/>
+            <wp:effectExtent l="0" t="0" r="6350" b="5080"/>
+            <wp:docPr id="16" name="图片 16" descr="32896e5c44df3c41ddace48dc105f65d"/>
+            <wp:cNvGraphicFramePr>
+              <a:graphicFrameLocks xmlns:a="http://schemas.openxmlformats.org/drawingml/2006/main" noChangeAspect="1"/>
+            </wp:cNvGraphicFramePr>
+            <a:graphic xmlns:a="http://schemas.openxmlformats.org/drawingml/2006/main">
+              <a:graphicData uri="http://schemas.openxmlformats.org/drawingml/2006/picture">
+                <pic:pic xmlns:pic="http://schemas.openxmlformats.org/drawingml/2006/picture">
+                  <pic:nvPicPr>
+                    <pic:cNvPr id="16" name="图片 16" descr="32896e5c44df3c41ddace48dc105f65d"/>
+                    <pic:cNvPicPr>
+                      <a:picLocks noChangeAspect="1"/>
+                    </pic:cNvPicPr>
+                  </pic:nvPicPr>
+                  <pic:blipFill>
+                    <a:blip r:embed="rId9"/>
+                    <a:stretch>
+                      <a:fillRect/>
+                    </a:stretch>
+                  </pic:blipFill>
+                  <pic:spPr>
+                    <a:xfrm>
+                      <a:off x="0" y="0"/>
+                      <a:ext cx="2533650" cy="2319020"/>
+                    </a:xfrm>
+                    <a:prstGeom prst="rect">
+                      <a:avLst/>
+                    </a:prstGeom>
+                  </pic:spPr>
+                </pic:pic>
+              </a:graphicData>
+            </a:graphic>
+          </wp:inline>
+        </w:drawing>
+      </w:r>
+    </w:p>
+    <w:p>
+      <w:pPr>
+        <w:jc w:val="center"/>
+        <w:rPr>
+          <w:rFonts w:hint="default" w:ascii="Times New Roman" w:hAnsi="Times New Roman" w:eastAsia="宋体" w:cs="Times New Roman"/>
+          <w:sz w:val="24"/>
+          <w:szCs w:val="24"/>
+          <w:lang w:val="en-US" w:eastAsia="zh-CN"/>
+        </w:rPr>
+      </w:pPr>
+      <w:r>
+        <w:rPr>
+          <w:rFonts w:hint="default" w:ascii="Times New Roman" w:hAnsi="Times New Roman" w:eastAsia="宋体" w:cs="Times New Roman"/>
+          <w:sz w:val="24"/>
+          <w:szCs w:val="24"/>
+          <w:lang w:val="en-US" w:eastAsia="zh-CN"/>
+        </w:rPr>
+        <w:t>抓包总览</w:t>
+      </w:r>
+    </w:p>
+    <w:p>
+      <w:pPr>
+        <w:jc w:val="center"/>
+        <w:rPr>
+          <w:rFonts w:hint="default" w:ascii="Times New Roman" w:hAnsi="Times New Roman" w:eastAsia="宋体" w:cs="Times New Roman"/>
+          <w:sz w:val="24"/>
+          <w:szCs w:val="24"/>
+          <w:lang w:val="en-US" w:eastAsia="zh-CN"/>
+        </w:rPr>
+      </w:pPr>
+      <w:r>
+        <w:rPr>
+          <w:rFonts w:hint="default" w:ascii="Times New Roman" w:hAnsi="Times New Roman" w:eastAsia="宋体" w:cs="Times New Roman"/>
+          <w:sz w:val="24"/>
+          <w:szCs w:val="24"/>
+        </w:rPr>
+        <w:drawing>
+          <wp:inline distT="0" distB="0" distL="114300" distR="114300">
+            <wp:extent cx="2635885" cy="2428875"/>
+            <wp:effectExtent l="0" t="0" r="5715" b="9525"/>
+            <wp:docPr id="12" name="图片 12"/>
+            <wp:cNvGraphicFramePr>
+              <a:graphicFrameLocks xmlns:a="http://schemas.openxmlformats.org/drawingml/2006/main" noChangeAspect="1"/>
+            </wp:cNvGraphicFramePr>
+            <a:graphic xmlns:a="http://schemas.openxmlformats.org/drawingml/2006/main">
+              <a:graphicData uri="http://schemas.openxmlformats.org/drawingml/2006/picture">
+                <pic:pic xmlns:pic="http://schemas.openxmlformats.org/drawingml/2006/picture">
+                  <pic:nvPicPr>
+                    <pic:cNvPr id="12" name="图片 12"/>
+                    <pic:cNvPicPr>
+                      <a:picLocks noChangeAspect="1"/>
+                    </pic:cNvPicPr>
+                  </pic:nvPicPr>
+                  <pic:blipFill>
+                    <a:blip r:embed="rId10"/>
+                    <a:stretch>
+                      <a:fillRect/>
+                    </a:stretch>
+                  </pic:blipFill>
+                  <pic:spPr>
+                    <a:xfrm>
+                      <a:off x="0" y="0"/>
+                      <a:ext cx="2635885" cy="2428875"/>
+                    </a:xfrm>
+                    <a:prstGeom prst="rect">
+                      <a:avLst/>
+                    </a:prstGeom>
+                    <a:noFill/>
+                    <a:ln>
+                      <a:noFill/>
+                    </a:ln>
+                  </pic:spPr>
+                </pic:pic>
+              </a:graphicData>
+            </a:graphic>
+          </wp:inline>
+        </w:drawing>
+      </w:r>
+    </w:p>
+    <w:p>
+      <w:pPr>
+        <w:rPr>
+          <w:rFonts w:hint="default" w:ascii="Times New Roman" w:hAnsi="Times New Roman" w:eastAsia="宋体" w:cs="Times New Roman"/>
+          <w:sz w:val="24"/>
+          <w:szCs w:val="24"/>
+          <w:lang w:val="en-US" w:eastAsia="zh-CN"/>
+        </w:rPr>
+      </w:pPr>
+      <w:r>
+        <w:rPr>
+          <w:rFonts w:hint="default" w:ascii="Times New Roman" w:hAnsi="Times New Roman" w:eastAsia="宋体" w:cs="Times New Roman"/>
+          <w:sz w:val="24"/>
+          <w:szCs w:val="24"/>
+          <w:lang w:val="en-US" w:eastAsia="zh-CN"/>
+        </w:rPr>
+        <w:t>Initialization(Type=1)：如图所示，客户端向服务端发送的第一个数据包Payload长度为4字节，十六进制解码为无符号整数，代表切分的总块数N。</w:t>
+      </w:r>
+    </w:p>
+    <w:p>
+      <w:pPr>
+        <w:jc w:val="center"/>
+        <w:rPr>
+          <w:rFonts w:hint="default" w:ascii="Times New Roman" w:hAnsi="Times New Roman" w:eastAsia="宋体" w:cs="Times New Roman"/>
+          <w:sz w:val="24"/>
+          <w:szCs w:val="24"/>
+          <w:lang w:val="en-US" w:eastAsia="zh-CN"/>
+        </w:rPr>
+      </w:pPr>
+      <w:r>
+        <w:rPr>
+          <w:rFonts w:hint="default" w:ascii="Times New Roman" w:hAnsi="Times New Roman" w:eastAsia="宋体" w:cs="Times New Roman"/>
+          <w:sz w:val="24"/>
+          <w:szCs w:val="24"/>
+        </w:rPr>
+        <w:drawing>
+          <wp:inline distT="0" distB="0" distL="114300" distR="114300">
+            <wp:extent cx="2635885" cy="2426970"/>
+            <wp:effectExtent l="0" t="0" r="5715" b="11430"/>
+            <wp:docPr id="17" name="图片 13"/>
+            <wp:cNvGraphicFramePr>
+              <a:graphicFrameLocks xmlns:a="http://schemas.openxmlformats.org/drawingml/2006/main" noChangeAspect="1"/>
+            </wp:cNvGraphicFramePr>
+            <a:graphic xmlns:a="http://schemas.openxmlformats.org/drawingml/2006/main">
+              <a:graphicData uri="http://schemas.openxmlformats.org/drawingml/2006/picture">
+                <pic:pic xmlns:pic="http://schemas.openxmlformats.org/drawingml/2006/picture">
+                  <pic:nvPicPr>
+                    <pic:cNvPr id="17" name="图片 13"/>
+                    <pic:cNvPicPr>
+                      <a:picLocks noChangeAspect="1"/>
+                    </pic:cNvPicPr>
+                  </pic:nvPicPr>
+                  <pic:blipFill>
+                    <a:blip r:embed="rId11"/>
+                    <a:stretch>
+                      <a:fillRect/>
+                    </a:stretch>
+                  </pic:blipFill>
+                  <pic:spPr>
+                    <a:xfrm>
+                      <a:off x="0" y="0"/>
+                      <a:ext cx="2635885" cy="2426970"/>
+                    </a:xfrm>
+                    <a:prstGeom prst="rect">
+                      <a:avLst/>
+                    </a:prstGeom>
+                    <a:noFill/>
+                    <a:ln>
+                      <a:noFill/>
+                    </a:ln>
+                  </pic:spPr>
+                </pic:pic>
+              </a:graphicData>
+            </a:graphic>
+          </wp:inline>
+        </w:drawing>
+      </w:r>
+    </w:p>
+    <w:p>
+      <w:pPr>
+        <w:rPr>
+          <w:rFonts w:hint="default" w:ascii="Times New Roman" w:hAnsi="Times New Roman" w:eastAsia="宋体" w:cs="Times New Roman"/>
+          <w:sz w:val="24"/>
+          <w:szCs w:val="24"/>
+          <w:lang w:val="en-US" w:eastAsia="zh-CN"/>
+        </w:rPr>
+      </w:pPr>
+      <w:r>
+        <w:rPr>
+          <w:rFonts w:hint="default" w:ascii="Times New Roman" w:hAnsi="Times New Roman" w:eastAsia="宋体" w:cs="Times New Roman"/>
+          <w:sz w:val="24"/>
+          <w:szCs w:val="24"/>
+          <w:lang w:val="en-US" w:eastAsia="zh-CN"/>
+        </w:rPr>
+        <w:t>agree(Type=2)：服务端返回的报文，Type字段为2，Payload长度为0，表示准备就绪。</w:t>
+      </w:r>
+    </w:p>
+    <w:p>
+      <w:pPr>
+        <w:rPr>
+          <w:rFonts w:hint="default" w:ascii="Times New Roman" w:hAnsi="Times New Roman" w:eastAsia="宋体" w:cs="Times New Roman"/>
+          <w:sz w:val="24"/>
+          <w:szCs w:val="24"/>
+          <w:lang w:val="en-US" w:eastAsia="zh-CN"/>
+        </w:rPr>
+      </w:pPr>
+    </w:p>
+    <w:p>
+      <w:pPr>
+        <w:jc w:val="center"/>
+        <w:rPr>
+          <w:rFonts w:hint="default" w:ascii="Times New Roman" w:hAnsi="Times New Roman" w:eastAsia="宋体" w:cs="Times New Roman"/>
+          <w:sz w:val="24"/>
+          <w:szCs w:val="24"/>
+        </w:rPr>
+      </w:pPr>
+      <w:r>
+        <w:rPr>
+          <w:rFonts w:hint="default" w:ascii="Times New Roman" w:hAnsi="Times New Roman" w:eastAsia="宋体" w:cs="Times New Roman"/>
+          <w:sz w:val="24"/>
+          <w:szCs w:val="24"/>
+        </w:rPr>
+        <w:drawing>
+          <wp:inline distT="0" distB="0" distL="114300" distR="114300">
+            <wp:extent cx="2643505" cy="2433955"/>
+            <wp:effectExtent l="0" t="0" r="10795" b="4445"/>
+            <wp:docPr id="18" name="图片 14"/>
+            <wp:cNvGraphicFramePr>
+              <a:graphicFrameLocks xmlns:a="http://schemas.openxmlformats.org/drawingml/2006/main" noChangeAspect="1"/>
+            </wp:cNvGraphicFramePr>
+            <a:graphic xmlns:a="http://schemas.openxmlformats.org/drawingml/2006/main">
+              <a:graphicData uri="http://schemas.openxmlformats.org/drawingml/2006/picture">
+                <pic:pic xmlns:pic="http://schemas.openxmlformats.org/drawingml/2006/picture">
+                  <pic:nvPicPr>
+                    <pic:cNvPr id="18" name="图片 14"/>
+                    <pic:cNvPicPr>
+                      <a:picLocks noChangeAspect="1"/>
+                    </pic:cNvPicPr>
+                  </pic:nvPicPr>
+                  <pic:blipFill>
+                    <a:blip r:embed="rId12"/>
+                    <a:stretch>
+                      <a:fillRect/>
+                    </a:stretch>
+                  </pic:blipFill>
+                  <pic:spPr>
+                    <a:xfrm>
+                      <a:off x="0" y="0"/>
+                      <a:ext cx="2643505" cy="2433955"/>
+                    </a:xfrm>
+                    <a:prstGeom prst="rect">
+                      <a:avLst/>
+                    </a:prstGeom>
+                    <a:noFill/>
+                    <a:ln>
+                      <a:noFill/>
+                    </a:ln>
+                  </pic:spPr>
+                </pic:pic>
+              </a:graphicData>
+            </a:graphic>
+          </wp:inline>
+        </w:drawing>
+      </w:r>
+    </w:p>
+    <w:p>
+      <w:pPr>
+        <w:rPr>
+          <w:rFonts w:hint="default" w:ascii="Times New Roman" w:hAnsi="Times New Roman" w:eastAsia="宋体" w:cs="Times New Roman"/>
+          <w:sz w:val="24"/>
+          <w:szCs w:val="24"/>
+          <w:lang w:val="en-US" w:eastAsia="zh-CN"/>
+        </w:rPr>
+      </w:pPr>
+      <w:r>
+        <w:rPr>
+          <w:rFonts w:hint="default" w:ascii="Times New Roman" w:hAnsi="Times New Roman" w:eastAsia="宋体" w:cs="Times New Roman"/>
+          <w:sz w:val="24"/>
+          <w:szCs w:val="24"/>
+          <w:lang w:val="en-US" w:eastAsia="zh-CN"/>
+        </w:rPr>
+        <w:t>reverseRequest(Type=3)：客户端发送的请求报文，包含了长度在[Lmin,Lmax]之间的随机大小的待反转文本。</w:t>
+      </w:r>
+    </w:p>
+    <w:p>
+      <w:pPr>
+        <w:jc w:val="center"/>
+        <w:rPr>
+          <w:rFonts w:hint="default" w:ascii="Times New Roman" w:hAnsi="Times New Roman" w:eastAsia="宋体" w:cs="Times New Roman"/>
+          <w:sz w:val="24"/>
+          <w:szCs w:val="24"/>
+          <w:lang w:val="en-US" w:eastAsia="zh-CN"/>
+        </w:rPr>
+      </w:pPr>
+      <w:r>
+        <w:rPr>
+          <w:rFonts w:hint="default" w:ascii="Times New Roman" w:hAnsi="Times New Roman" w:eastAsia="宋体" w:cs="Times New Roman"/>
+          <w:sz w:val="24"/>
+          <w:szCs w:val="24"/>
+        </w:rPr>
+        <w:drawing>
+          <wp:inline distT="0" distB="0" distL="114300" distR="114300">
+            <wp:extent cx="2635885" cy="2426970"/>
+            <wp:effectExtent l="0" t="0" r="5715" b="11430"/>
+            <wp:docPr id="19" name="图片 15"/>
+            <wp:cNvGraphicFramePr>
+              <a:graphicFrameLocks xmlns:a="http://schemas.openxmlformats.org/drawingml/2006/main" noChangeAspect="1"/>
+            </wp:cNvGraphicFramePr>
+            <a:graphic xmlns:a="http://schemas.openxmlformats.org/drawingml/2006/main">
+              <a:graphicData uri="http://schemas.openxmlformats.org/drawingml/2006/picture">
+                <pic:pic xmlns:pic="http://schemas.openxmlformats.org/drawingml/2006/picture">
+                  <pic:nvPicPr>
+                    <pic:cNvPr id="19" name="图片 15"/>
+                    <pic:cNvPicPr>
+                      <a:picLocks noChangeAspect="1"/>
+                    </pic:cNvPicPr>
+                  </pic:nvPicPr>
+                  <pic:blipFill>
+                    <a:blip r:embed="rId13"/>
+                    <a:stretch>
+                      <a:fillRect/>
+                    </a:stretch>
+                  </pic:blipFill>
+                  <pic:spPr>
+                    <a:xfrm>
+                      <a:off x="0" y="0"/>
+                      <a:ext cx="2635885" cy="2426970"/>
+                    </a:xfrm>
+                    <a:prstGeom prst="rect">
+                      <a:avLst/>
+                    </a:prstGeom>
+                    <a:noFill/>
+                    <a:ln>
+                      <a:noFill/>
+                    </a:ln>
+                  </pic:spPr>
+                </pic:pic>
+              </a:graphicData>
+            </a:graphic>
+          </wp:inline>
+        </w:drawing>
+      </w:r>
+    </w:p>
+    <w:p>
+      <w:pPr>
+        <w:rPr>
+          <w:rFonts w:hint="default" w:ascii="Times New Roman" w:hAnsi="Times New Roman" w:eastAsia="宋体" w:cs="Times New Roman"/>
+          <w:sz w:val="24"/>
+          <w:szCs w:val="24"/>
+          <w:lang w:val="en-US" w:eastAsia="zh-CN"/>
+        </w:rPr>
+      </w:pPr>
+      <w:r>
+        <w:rPr>
+          <w:rFonts w:hint="default" w:ascii="Times New Roman" w:hAnsi="Times New Roman" w:eastAsia="宋体" w:cs="Times New Roman"/>
+          <w:sz w:val="24"/>
+          <w:szCs w:val="24"/>
+          <w:lang w:val="en-US" w:eastAsia="zh-CN"/>
+        </w:rPr>
+        <w:t>-reverseAnswer(Type=4)：服务端返回的应答报文，Payload中清晰可见文本内容已被整体倒序反转。</w:t>
+      </w:r>
+    </w:p>
+    <w:p>
+      <w:pPr>
+        <w:rPr>
+          <w:rFonts w:hint="default" w:ascii="Times New Roman" w:hAnsi="Times New Roman" w:eastAsia="宋体" w:cs="Times New Roman"/>
+          <w:sz w:val="24"/>
+          <w:szCs w:val="24"/>
+          <w:lang w:val="en-US" w:eastAsia="zh-CN"/>
+        </w:rPr>
+      </w:pPr>
+      <w:r>
+        <w:rPr>
+          <w:rFonts w:hint="default" w:ascii="Times New Roman" w:hAnsi="Times New Roman" w:eastAsia="宋体" w:cs="Times New Roman"/>
+          <w:sz w:val="24"/>
+          <w:szCs w:val="24"/>
+          <w:lang w:val="en-US" w:eastAsia="zh-CN"/>
+        </w:rPr>
+        <w:t>b.实现上的关键点和对应的(代码)解决方案</w:t>
+      </w:r>
+    </w:p>
+    <w:p>
+      <w:pPr>
+        <w:jc w:val="center"/>
+        <w:rPr>
+          <w:rFonts w:hint="default" w:ascii="Times New Roman" w:hAnsi="Times New Roman" w:eastAsia="宋体" w:cs="Times New Roman"/>
+          <w:sz w:val="24"/>
+          <w:szCs w:val="24"/>
+          <w:lang w:val="en-US" w:eastAsia="zh-CN"/>
+        </w:rPr>
+      </w:pPr>
+      <w:r>
+        <w:drawing>
+          <wp:inline distT="0" distB="0" distL="114300" distR="114300">
+            <wp:extent cx="5267325" cy="1694180"/>
+            <wp:effectExtent l="0" t="0" r="3175" b="7620"/>
+            <wp:docPr id="1" name="图片 1"/>
+            <wp:cNvGraphicFramePr>
+              <a:graphicFrameLocks xmlns:a="http://schemas.openxmlformats.org/drawingml/2006/main" noChangeAspect="1"/>
+            </wp:cNvGraphicFramePr>
+            <a:graphic xmlns:a="http://schemas.openxmlformats.org/drawingml/2006/main">
+              <a:graphicData uri="http://schemas.openxmlformats.org/drawingml/2006/picture">
+                <pic:pic xmlns:pic="http://schemas.openxmlformats.org/drawingml/2006/picture">
+                  <pic:nvPicPr>
+                    <pic:cNvPr id="1" name="图片 1"/>
+                    <pic:cNvPicPr>
+                      <a:picLocks noChangeAspect="1"/>
+                    </pic:cNvPicPr>
+                  </pic:nvPicPr>
+                  <pic:blipFill>
+                    <a:blip r:embed="rId14"/>
+                    <a:stretch>
+                      <a:fillRect/>
+                    </a:stretch>
+                  </pic:blipFill>
+                  <pic:spPr>
+                    <a:xfrm>
+                      <a:off x="0" y="0"/>
+                      <a:ext cx="5267325" cy="1694180"/>
+                    </a:xfrm>
+                    <a:prstGeom prst="rect">
+                      <a:avLst/>
+                    </a:prstGeom>
+                    <a:noFill/>
+                    <a:ln>
+                      <a:noFill/>
+                    </a:ln>
+                  </pic:spPr>
+                </pic:pic>
+              </a:graphicData>
+            </a:graphic>
+          </wp:inline>
+        </w:drawing>
+      </w:r>
+    </w:p>
+    <w:p>
+      <w:pPr>
+        <w:rPr>
+          <w:rFonts w:hint="default" w:ascii="Times New Roman" w:hAnsi="Times New Roman" w:eastAsia="宋体" w:cs="Times New Roman"/>
+          <w:sz w:val="24"/>
+          <w:szCs w:val="24"/>
+          <w:lang w:val="en-US" w:eastAsia="zh-CN"/>
+        </w:rPr>
+      </w:pPr>
+      <w:r>
+        <w:rPr>
+          <w:rFonts w:hint="default" w:ascii="Times New Roman" w:hAnsi="Times New Roman" w:eastAsia="宋体" w:cs="Times New Roman"/>
+          <w:sz w:val="24"/>
+          <w:szCs w:val="24"/>
+          <w:lang w:val="en-US" w:eastAsia="zh-CN"/>
+        </w:rPr>
+        <w:t>1.关键点：如何保证TCP字节流正确边界（粘包/半包问题）</w:t>
+      </w:r>
+    </w:p>
+    <w:p>
+      <w:pPr>
+        <w:rPr>
+          <w:rFonts w:hint="default" w:ascii="Times New Roman" w:hAnsi="Times New Roman" w:eastAsia="宋体" w:cs="Times New Roman"/>
+          <w:sz w:val="24"/>
+          <w:szCs w:val="24"/>
+          <w:lang w:val="en-US" w:eastAsia="zh-CN"/>
+        </w:rPr>
+      </w:pPr>
+      <w:r>
+        <w:rPr>
+          <w:rFonts w:hint="default" w:ascii="Times New Roman" w:hAnsi="Times New Roman" w:eastAsia="宋体" w:cs="Times New Roman"/>
+          <w:sz w:val="24"/>
+          <w:szCs w:val="24"/>
+          <w:lang w:val="en-US" w:eastAsia="zh-CN"/>
+        </w:rPr>
+        <w:t>解决方案：设计了自定义的应用层协议头部FRAME_HEADER=struct.Struct("!HI")，即2字节Type+4字节Payload_Length。在代码实现中，封装了严格的recv_exact(sock,size)函数，通过while循环确保每次读取指定长度的字节，直到完全收齐Header或Payload，彻底解决了TCP粘包问题。</w:t>
+      </w:r>
+    </w:p>
+    <w:p>
+      <w:pPr>
+        <w:jc w:val="center"/>
+        <w:rPr>
+          <w:rFonts w:hint="default" w:ascii="Times New Roman" w:hAnsi="Times New Roman" w:eastAsia="宋体" w:cs="Times New Roman"/>
+          <w:sz w:val="24"/>
+          <w:szCs w:val="24"/>
+          <w:lang w:val="en-US" w:eastAsia="zh-CN"/>
+        </w:rPr>
+      </w:pPr>
+      <w:r>
+        <w:drawing>
+          <wp:inline distT="0" distB="0" distL="114300" distR="114300">
+            <wp:extent cx="5264785" cy="4331970"/>
+            <wp:effectExtent l="0" t="0" r="5715" b="11430"/>
+            <wp:docPr id="2" name="图片 2"/>
+            <wp:cNvGraphicFramePr>
+              <a:graphicFrameLocks xmlns:a="http://schemas.openxmlformats.org/drawingml/2006/main" noChangeAspect="1"/>
+            </wp:cNvGraphicFramePr>
+            <a:graphic xmlns:a="http://schemas.openxmlformats.org/drawingml/2006/main">
+              <a:graphicData uri="http://schemas.openxmlformats.org/drawingml/2006/picture">
+                <pic:pic xmlns:pic="http://schemas.openxmlformats.org/drawingml/2006/picture">
+                  <pic:nvPicPr>
+                    <pic:cNvPr id="2" name="图片 2"/>
+                    <pic:cNvPicPr>
+                      <a:picLocks noChangeAspect="1"/>
+                    </pic:cNvPicPr>
+                  </pic:nvPicPr>
+                  <pic:blipFill>
+                    <a:blip r:embed="rId15"/>
+                    <a:stretch>
+                      <a:fillRect/>
+                    </a:stretch>
+                  </pic:blipFill>
+                  <pic:spPr>
+                    <a:xfrm>
+                      <a:off x="0" y="0"/>
+                      <a:ext cx="5264785" cy="4331970"/>
+                    </a:xfrm>
+                    <a:prstGeom prst="rect">
+                      <a:avLst/>
+                    </a:prstGeom>
+                    <a:noFill/>
+                    <a:ln>
+                      <a:noFill/>
+                    </a:ln>
+                  </pic:spPr>
+                </pic:pic>
+              </a:graphicData>
+            </a:graphic>
+          </wp:inline>
+        </w:drawing>
+      </w:r>
+    </w:p>
+    <w:p>
+      <w:pPr>
+        <w:rPr>
+          <w:rFonts w:hint="default" w:ascii="Times New Roman" w:hAnsi="Times New Roman" w:eastAsia="宋体" w:cs="Times New Roman"/>
+          <w:sz w:val="24"/>
+          <w:szCs w:val="24"/>
+          <w:lang w:val="en-US" w:eastAsia="zh-CN"/>
+        </w:rPr>
+      </w:pPr>
+      <w:r>
+        <w:rPr>
+          <w:rFonts w:hint="default" w:ascii="Times New Roman" w:hAnsi="Times New Roman" w:eastAsia="宋体" w:cs="Times New Roman"/>
+          <w:sz w:val="24"/>
+          <w:szCs w:val="24"/>
+          <w:lang w:val="en-US" w:eastAsia="zh-CN"/>
+        </w:rPr>
+        <w:t>2.关键点：如何实现服务端的高并发处理</w:t>
+      </w:r>
+    </w:p>
+    <w:p>
+      <w:pPr>
+        <w:rPr>
+          <w:rFonts w:hint="default" w:ascii="Times New Roman" w:hAnsi="Times New Roman" w:eastAsia="宋体" w:cs="Times New Roman"/>
+          <w:sz w:val="24"/>
+          <w:szCs w:val="24"/>
+          <w:lang w:val="en-US" w:eastAsia="zh-CN"/>
+        </w:rPr>
+      </w:pPr>
+      <w:r>
+        <w:rPr>
+          <w:rFonts w:hint="default" w:ascii="Times New Roman" w:hAnsi="Times New Roman" w:eastAsia="宋体" w:cs="Times New Roman"/>
+          <w:sz w:val="24"/>
+          <w:szCs w:val="24"/>
+          <w:lang w:val="en-US" w:eastAsia="zh-CN"/>
+        </w:rPr>
+        <w:t>解决方案：服务端在accept()接收到新连接后，使用threading.Thread(target=handle_client,args=(conn,),daemon=True)为每个客户端分配一个独立的守护线程。这样主线程可以继续监听新连接，互不阻塞，实现多客户端并发处理。</w:t>
+      </w:r>
+    </w:p>
+    <w:p>
+      <w:pPr>
+        <w:jc w:val="center"/>
+        <w:rPr>
+          <w:rFonts w:hint="default" w:ascii="Times New Roman" w:hAnsi="Times New Roman" w:eastAsia="宋体" w:cs="Times New Roman"/>
+          <w:sz w:val="24"/>
+          <w:szCs w:val="24"/>
+          <w:lang w:val="en-US" w:eastAsia="zh-CN"/>
+        </w:rPr>
+      </w:pPr>
+      <w:r>
+        <w:drawing>
+          <wp:inline distT="0" distB="0" distL="114300" distR="114300">
+            <wp:extent cx="5273675" cy="2607945"/>
+            <wp:effectExtent l="0" t="0" r="9525" b="8255"/>
+            <wp:docPr id="3" name="图片 3"/>
+            <wp:cNvGraphicFramePr>
+              <a:graphicFrameLocks xmlns:a="http://schemas.openxmlformats.org/drawingml/2006/main" noChangeAspect="1"/>
+            </wp:cNvGraphicFramePr>
+            <a:graphic xmlns:a="http://schemas.openxmlformats.org/drawingml/2006/main">
+              <a:graphicData uri="http://schemas.openxmlformats.org/drawingml/2006/picture">
+                <pic:pic xmlns:pic="http://schemas.openxmlformats.org/drawingml/2006/picture">
+                  <pic:nvPicPr>
+                    <pic:cNvPr id="3" name="图片 3"/>
+                    <pic:cNvPicPr>
+                      <a:picLocks noChangeAspect="1"/>
+                    </pic:cNvPicPr>
+                  </pic:nvPicPr>
+                  <pic:blipFill>
+                    <a:blip r:embed="rId16"/>
+                    <a:stretch>
+                      <a:fillRect/>
+                    </a:stretch>
+                  </pic:blipFill>
+                  <pic:spPr>
+                    <a:xfrm>
+                      <a:off x="0" y="0"/>
+                      <a:ext cx="5273675" cy="2607945"/>
+                    </a:xfrm>
+                    <a:prstGeom prst="rect">
+                      <a:avLst/>
+                    </a:prstGeom>
+                    <a:noFill/>
+                    <a:ln>
+                      <a:noFill/>
+                    </a:ln>
+                  </pic:spPr>
+                </pic:pic>
+              </a:graphicData>
+            </a:graphic>
+          </wp:inline>
+        </w:drawing>
+      </w:r>
+    </w:p>
+    <w:p>
+      <w:pPr>
+        <w:rPr>
+          <w:rFonts w:hint="default" w:ascii="Times New Roman" w:hAnsi="Times New Roman" w:eastAsia="宋体" w:cs="Times New Roman"/>
+          <w:sz w:val="24"/>
+          <w:szCs w:val="24"/>
+          <w:lang w:val="en-US" w:eastAsia="zh-CN"/>
+        </w:rPr>
+      </w:pPr>
+      <w:r>
+        <w:rPr>
+          <w:rFonts w:hint="default" w:ascii="Times New Roman" w:hAnsi="Times New Roman" w:eastAsia="宋体" w:cs="Times New Roman"/>
+          <w:sz w:val="24"/>
+          <w:szCs w:val="24"/>
+          <w:lang w:val="en-US" w:eastAsia="zh-CN"/>
+        </w:rPr>
+        <w:t>3.关键点：文件分块与乱序组合</w:t>
+      </w:r>
+    </w:p>
+    <w:p>
+      <w:pPr>
+        <w:rPr>
+          <w:rFonts w:hint="default" w:ascii="Times New Roman" w:hAnsi="Times New Roman" w:eastAsia="宋体" w:cs="Times New Roman"/>
+          <w:sz w:val="24"/>
+          <w:szCs w:val="24"/>
+          <w:lang w:val="en-US" w:eastAsia="zh-CN"/>
+        </w:rPr>
+      </w:pPr>
+      <w:r>
+        <w:rPr>
+          <w:rFonts w:hint="default" w:ascii="Times New Roman" w:hAnsi="Times New Roman" w:eastAsia="宋体" w:cs="Times New Roman"/>
+          <w:sz w:val="24"/>
+          <w:szCs w:val="24"/>
+          <w:lang w:val="en-US" w:eastAsia="zh-CN"/>
+        </w:rPr>
+        <w:t>解决方案：客户端的split_chunks函数使用random.Random(seed).randint(lmin,lmax)算法生成边界。由于文件切块后按序发送，但组装时需要倒序（原文件的最后一块反转后应该在最前面），客户端使用字典responses[chunk.index]保存反转结果，并在最后使用b"".join(responses[index]for index in range(len(chunks), 0, -1))逆序拼接，保证整个文件反转的正确性。</w:t>
+      </w:r>
+    </w:p>
+    <w:p>
+      <w:pPr>
+        <w:rPr>
+          <w:rFonts w:hint="default" w:ascii="Times New Roman" w:hAnsi="Times New Roman" w:eastAsia="宋体" w:cs="Times New Roman"/>
+          <w:sz w:val="24"/>
+          <w:szCs w:val="24"/>
+          <w:lang w:val="en-US" w:eastAsia="zh-CN"/>
+        </w:rPr>
+      </w:pPr>
+      <w:r>
+        <w:rPr>
+          <w:rFonts w:hint="default" w:ascii="Times New Roman" w:hAnsi="Times New Roman" w:eastAsia="宋体" w:cs="Times New Roman"/>
+          <w:sz w:val="24"/>
+          <w:szCs w:val="24"/>
+          <w:lang w:val="en-US" w:eastAsia="zh-CN"/>
+        </w:rPr>
+        <w:t>c.用到并掌握的知识点总结</w:t>
+      </w:r>
+    </w:p>
+    <w:p>
+      <w:pPr>
+        <w:rPr>
+          <w:rFonts w:hint="default" w:ascii="Times New Roman" w:hAnsi="Times New Roman" w:eastAsia="宋体" w:cs="Times New Roman"/>
+          <w:sz w:val="24"/>
+          <w:szCs w:val="24"/>
+          <w:lang w:val="en-US" w:eastAsia="zh-CN"/>
+        </w:rPr>
+      </w:pPr>
+      <w:r>
+        <w:rPr>
+          <w:rFonts w:hint="default" w:ascii="Times New Roman" w:hAnsi="Times New Roman" w:eastAsia="宋体" w:cs="Times New Roman"/>
+          <w:sz w:val="24"/>
+          <w:szCs w:val="24"/>
+          <w:lang w:val="en-US" w:eastAsia="zh-CN"/>
+        </w:rPr>
+        <w:t>Python的基础语法与面向对象编程（类的封装）。</w:t>
+      </w:r>
+    </w:p>
+    <w:p>
+      <w:pPr>
+        <w:rPr>
+          <w:rFonts w:hint="default" w:ascii="Times New Roman" w:hAnsi="Times New Roman" w:eastAsia="宋体" w:cs="Times New Roman"/>
+          <w:sz w:val="24"/>
+          <w:szCs w:val="24"/>
+          <w:lang w:val="en-US" w:eastAsia="zh-CN"/>
+        </w:rPr>
+      </w:pPr>
+      <w:r>
+        <w:rPr>
+          <w:rFonts w:hint="default" w:ascii="Times New Roman" w:hAnsi="Times New Roman" w:eastAsia="宋体" w:cs="Times New Roman"/>
+          <w:sz w:val="24"/>
+          <w:szCs w:val="24"/>
+          <w:lang w:val="en-US" w:eastAsia="zh-CN"/>
+        </w:rPr>
+        <w:t>TCP/IP协议栈基础理论，三次握手与四次挥手过程。</w:t>
+      </w:r>
+    </w:p>
+    <w:p>
+      <w:pPr>
+        <w:rPr>
+          <w:rFonts w:hint="default" w:ascii="Times New Roman" w:hAnsi="Times New Roman" w:eastAsia="宋体" w:cs="Times New Roman"/>
+          <w:sz w:val="24"/>
+          <w:szCs w:val="24"/>
+          <w:lang w:val="en-US" w:eastAsia="zh-CN"/>
+        </w:rPr>
+      </w:pPr>
+      <w:r>
+        <w:rPr>
+          <w:rFonts w:hint="default" w:ascii="Times New Roman" w:hAnsi="Times New Roman" w:eastAsia="宋体" w:cs="Times New Roman"/>
+          <w:sz w:val="24"/>
+          <w:szCs w:val="24"/>
+          <w:lang w:val="en-US" w:eastAsia="zh-CN"/>
+        </w:rPr>
+        <w:t>文件I/O操作与基本的字节流（bytes）处理。</w:t>
+      </w:r>
+    </w:p>
+    <w:p>
+      <w:pPr>
+        <w:rPr>
+          <w:rFonts w:hint="default" w:ascii="Times New Roman" w:hAnsi="Times New Roman" w:eastAsia="宋体" w:cs="Times New Roman"/>
+          <w:sz w:val="24"/>
+          <w:szCs w:val="24"/>
+          <w:lang w:val="en-US" w:eastAsia="zh-CN"/>
+        </w:rPr>
+      </w:pPr>
+      <w:r>
+        <w:rPr>
+          <w:rFonts w:hint="eastAsia" w:cs="Times New Roman"/>
+          <w:sz w:val="24"/>
+          <w:szCs w:val="24"/>
+          <w:lang w:val="en-US" w:eastAsia="zh-CN"/>
+        </w:rPr>
+        <w:t>了解</w:t>
+      </w:r>
+      <w:r>
+        <w:rPr>
+          <w:rFonts w:hint="default" w:ascii="Times New Roman" w:hAnsi="Times New Roman" w:eastAsia="宋体" w:cs="Times New Roman"/>
+          <w:sz w:val="24"/>
+          <w:szCs w:val="24"/>
+          <w:lang w:val="en-US" w:eastAsia="zh-CN"/>
+        </w:rPr>
+        <w:t>了socket,bind,listen,accept,recv,sendall等系统调用的具体用法。</w:t>
+      </w:r>
+    </w:p>
+    <w:p>
+      <w:pPr>
+        <w:rPr>
+          <w:rFonts w:hint="default" w:ascii="Times New Roman" w:hAnsi="Times New Roman" w:eastAsia="宋体" w:cs="Times New Roman"/>
+          <w:sz w:val="24"/>
+          <w:szCs w:val="24"/>
+          <w:lang w:val="en-US" w:eastAsia="zh-CN"/>
+        </w:rPr>
+      </w:pPr>
+      <w:r>
+        <w:rPr>
+          <w:rFonts w:hint="default" w:ascii="Times New Roman" w:hAnsi="Times New Roman" w:eastAsia="宋体" w:cs="Times New Roman"/>
+          <w:sz w:val="24"/>
+          <w:szCs w:val="24"/>
+          <w:lang w:val="en-US" w:eastAsia="zh-CN"/>
+        </w:rPr>
+        <w:t>粘包处理机制：深刻理解了TCP是“面向字节流”而非“面向报文”的，并亲自实现了基于Length字段的循环定长读取机制来切分报文边界。</w:t>
+      </w:r>
+    </w:p>
+    <w:p>
+      <w:pPr>
+        <w:rPr>
+          <w:rFonts w:hint="default" w:ascii="Times New Roman" w:hAnsi="Times New Roman" w:eastAsia="宋体" w:cs="Times New Roman"/>
+          <w:sz w:val="24"/>
+          <w:szCs w:val="24"/>
+          <w:lang w:val="en-US" w:eastAsia="zh-CN"/>
+        </w:rPr>
+      </w:pPr>
+      <w:r>
+        <w:rPr>
+          <w:rFonts w:hint="default" w:ascii="Times New Roman" w:hAnsi="Times New Roman" w:eastAsia="宋体" w:cs="Times New Roman"/>
+          <w:sz w:val="24"/>
+          <w:szCs w:val="24"/>
+          <w:lang w:val="en-US" w:eastAsia="zh-CN"/>
+        </w:rPr>
+        <w:t>多线程并发模型：掌握了利用Python threading模块处理并发网络连接的基本模型，理解了主线程监听、子线程处理的架构。</w:t>
+      </w:r>
+    </w:p>
+    <w:p>
+      <w:pPr>
+        <w:rPr>
+          <w:rFonts w:hint="default" w:ascii="Times New Roman" w:hAnsi="Times New Roman" w:eastAsia="宋体" w:cs="Times New Roman"/>
+          <w:sz w:val="24"/>
+          <w:szCs w:val="24"/>
+          <w:lang w:val="en-US" w:eastAsia="zh-CN"/>
+        </w:rPr>
+      </w:pPr>
+      <w:r>
+        <w:rPr>
+          <w:rFonts w:hint="default" w:ascii="Times New Roman" w:hAnsi="Times New Roman" w:eastAsia="宋体" w:cs="Times New Roman"/>
+          <w:sz w:val="24"/>
+          <w:szCs w:val="24"/>
+          <w:lang w:val="en-US" w:eastAsia="zh-CN"/>
+        </w:rPr>
+        <w:t>Wireshark使用：掌握了使用过滤器（Capture Filters）抓取指定端口流量的方法。</w:t>
+      </w:r>
+    </w:p>
+    <w:p>
+      <w:pPr>
+        <w:rPr>
+          <w:rFonts w:hint="default" w:ascii="Times New Roman" w:hAnsi="Times New Roman" w:eastAsia="宋体" w:cs="Times New Roman"/>
+          <w:sz w:val="24"/>
+          <w:szCs w:val="24"/>
+          <w:lang w:val="en-US" w:eastAsia="zh-CN"/>
+        </w:rPr>
+      </w:pPr>
+      <w:r>
+        <w:rPr>
+          <w:rFonts w:hint="default" w:ascii="Times New Roman" w:hAnsi="Times New Roman" w:eastAsia="宋体" w:cs="Times New Roman"/>
+          <w:sz w:val="24"/>
+          <w:szCs w:val="24"/>
+          <w:lang w:val="en-US" w:eastAsia="zh-CN"/>
+        </w:rPr>
+        <w:t>d.Git的URL</w:t>
+      </w:r>
+    </w:p>
+    <w:p>
+      <w:pPr>
+        <w:rPr>
+          <w:rFonts w:hint="default" w:ascii="Times New Roman" w:hAnsi="Times New Roman" w:eastAsia="宋体" w:cs="Times New Roman"/>
+          <w:sz w:val="24"/>
+          <w:szCs w:val="24"/>
+          <w:lang w:val="en-US" w:eastAsia="zh-CN"/>
+        </w:rPr>
+      </w:pPr>
+      <w:r>
+        <w:rPr>
+          <w:rFonts w:hint="default" w:ascii="Times New Roman" w:hAnsi="Times New Roman" w:eastAsia="宋体" w:cs="Times New Roman"/>
+          <w:sz w:val="24"/>
+          <w:szCs w:val="24"/>
+          <w:lang w:val="en-US" w:eastAsia="zh-CN"/>
+        </w:rPr>
+        <w:t>https://github.c</w:t>
       </w:r>
       <w:bookmarkStart w:id="0" w:name="_GoBack"/>
       <w:bookmarkEnd w:id="0"/>
       <w:r>
         <w:rPr>
-          <w:rFonts w:hint="eastAsia" w:ascii="黑体" w:eastAsia="黑体"/>
-          <w:sz w:val="30"/>
-          <w:szCs w:val="30"/>
-          <w:lang w:val="en-US" w:eastAsia="zh-CN"/>
-        </w:rPr>
-        <w:t>:</w:t>
-      </w:r>
-    </w:p>
-    <w:p>
-      <w:pPr>
-        <w:rPr>
-          <w:rFonts w:hint="eastAsia" w:ascii="黑体" w:hAnsi="Times New Roman" w:eastAsia="黑体" w:cs="Times New Roman"/>
-          <w:sz w:val="30"/>
-          <w:szCs w:val="30"/>
-          <w:lang w:val="en-US" w:eastAsia="zh-CN"/>
-        </w:rPr>
-      </w:pPr>
-      <w:r>
-        <w:rPr>
-          <w:rFonts w:hint="eastAsia" w:ascii="黑体" w:hAnsi="Times New Roman" w:eastAsia="黑体" w:cs="Times New Roman"/>
-          <w:sz w:val="30"/>
-          <w:szCs w:val="30"/>
-          <w:lang w:val="en-US" w:eastAsia="zh-CN"/>
-        </w:rPr>
-        <w:t>实习结论分析：</w:t>
-      </w:r>
-    </w:p>
-    <w:p>
-      <w:pPr>
-        <w:rPr>
-          <w:rFonts w:hint="eastAsia" w:ascii="黑体" w:hAnsi="Times New Roman" w:eastAsia="黑体" w:cs="Times New Roman"/>
-          <w:sz w:val="30"/>
-          <w:szCs w:val="30"/>
-          <w:lang w:val="en-US" w:eastAsia="zh-CN"/>
-        </w:rPr>
-      </w:pPr>
+          <w:rFonts w:hint="default" w:ascii="Times New Roman" w:hAnsi="Times New Roman" w:eastAsia="宋体" w:cs="Times New Roman"/>
+          <w:sz w:val="24"/>
+          <w:szCs w:val="24"/>
+          <w:lang w:val="en-US" w:eastAsia="zh-CN"/>
+        </w:rPr>
+        <w:t>om/ylhsrsz/cnw.git</w:t>
+      </w:r>
     </w:p>
     <w:p/>
     <w:sectPr>

</xml_diff>